<commit_message>
Calibrar deteccion y validar integraciones locales
</commit_message>
<xml_diff>
--- a/Guia_01_Flujo_y_funcionamiento.docx
+++ b/Guia_01_Flujo_y_funcionamiento.docx
@@ -1546,7 +1546,7 @@
           <w:color w:val="1F2937"/>
           <w:sz w:val="22"/>
         </w:rPr>
-        <w:t>5. El modo combinado pondera ambos resultados y aplica el umbral; la explicación muestra qué señales activaron el riesgo.</w:t>
+        <w:t>5. El modo combinado aplica la fusión calibrada 20/80 y el umbral 45; si una evidencia alcanza 70 no se diluye, y la explicación muestra qué señales activaron el riesgo.</w:t>
       </w:r>
     </w:p>
     <w:p>
@@ -1623,7 +1623,7 @@
           <w:color w:val="1F2937"/>
           <w:sz w:val="22"/>
         </w:rPr>
-        <w:t>Validación: 72 pruebas Python y 2 recorridos reales de navegador; uno levanta Streamlit y backend por separado. Comprueban comportamiento y arquitectura, no eficacia estadística en producción.</w:t>
+        <w:t>Validación: 81 pruebas Python y 2 recorridos reales de navegador; uno levanta Streamlit y backend por separado y otra prueba local recorre Gmail, HTTP y Telegram. Comprueban comportamiento y arquitectura, no eficacia estadística en producción.</w:t>
       </w:r>
     </w:p>
     <w:sectPr>

</xml_diff>

<commit_message>
Mejorar detección BEC y preparar evidencia de defensa
</commit_message>
<xml_diff>
--- a/Guia_01_Flujo_y_funcionamiento.docx
+++ b/Guia_01_Flujo_y_funcionamiento.docx
@@ -1546,7 +1546,7 @@
           <w:color w:val="1F2937"/>
           <w:sz w:val="22"/>
         </w:rPr>
-        <w:t>5. El modo combinado aplica la fusión calibrada 20/80 y el umbral 45; si una evidencia alcanza 70 no se diluye, y la explicación muestra qué señales activaron el riesgo.</w:t>
+        <w:t>5. El modo combinado aplica la fusión calibrada 35/65 y el umbral 26; si una evidencia alcanza 70 no se diluye, y la explicación muestra qué señales activaron el riesgo.</w:t>
       </w:r>
     </w:p>
     <w:p>
@@ -1623,7 +1623,7 @@
           <w:color w:val="1F2937"/>
           <w:sz w:val="22"/>
         </w:rPr>
-        <w:t>Validación: 81 pruebas Python y 2 recorridos reales de navegador; uno levanta Streamlit y backend por separado y otra prueba local recorre Gmail, HTTP y Telegram. Comprueban comportamiento y arquitectura, no eficacia estadística en producción.</w:t>
+        <w:t>Validación: 87 pruebas Python y 2 recorridos reales de navegador; uno levanta Streamlit y backend por separado y otra prueba local recorre Gmail, HTTP y Telegram. Comprueban comportamiento y arquitectura, no eficacia estadística en producción.</w:t>
       </w:r>
     </w:p>
     <w:sectPr>

</xml_diff>

<commit_message>
Renovar interfaz web de Streamlit
</commit_message>
<xml_diff>
--- a/Guia_01_Flujo_y_funcionamiento.docx
+++ b/Guia_01_Flujo_y_funcionamiento.docx
@@ -113,7 +113,7 @@
           <w:color w:val="1F2937"/>
           <w:sz w:val="22"/>
         </w:rPr>
-        <w:t>El montaje es cliente-servidor. El navegador usa Streamlit como capa de presentación y Streamlit envía peticiones HTTP/JSON al backend central. La extensión y el monitor también consumen esa API. Solo el servidor parsea, analiza, entrena y guarda los modelos; Gmail y Telegram son integraciones externas.</w:t>
+        <w:t>El montaje es cliente-servidor. El navegador usa Streamlit como capa de presentación y Streamlit envía peticiones HTTP/JSON al backend central. La extensión y el monitor también consumen esa API. Solo el servidor parsea, analiza, entrena y guarda los modelos; Gmail y Telegram son integraciones externas. La web comparte una interfaz adaptable con navegación de marca, estados homogéneos y un flujo de detección ordenado en tres pasos.</w:t>
       </w:r>
     </w:p>
     <w:tbl>
@@ -1611,19 +1611,7 @@
           <w:color w:val="1F2937"/>
           <w:sz w:val="22"/>
         </w:rPr>
-        <w:t>El MLP necesita datos representativos y evaluación separada; una accuracy de entrenamiento no demuestra generalización.</w:t>
-      </w:r>
-    </w:p>
-    <w:p>
-      <w:r>
-        <w:rPr>
-          <w:rFonts w:ascii="Calibri" w:hAnsi="Calibri"/>
-          <w:b w:val="0"/>
-          <w:i w:val="0"/>
-          <w:color w:val="1F2937"/>
-          <w:sz w:val="22"/>
-        </w:rPr>
-        <w:t>Validación: 87 pruebas Python y 2 recorridos reales de navegador; uno levanta Streamlit y backend por separado y otra prueba local recorre Gmail, HTTP y Telegram. Comprueban comportamiento y arquitectura, no eficacia estadística en producción.</w:t>
+        <w:t>El MLP necesita datos representativos y evaluación separada; una accuracy de entrenamiento no demuestra generalización. La evidencia funcional suma 87 pruebas Python y 2 recorridos reales (web-backend y Gmail-HTTP-Telegram): verifican arquitectura y comportamiento, no eficacia estadística en producción.</w:t>
       </w:r>
     </w:p>
     <w:sectPr>

</xml_diff>

<commit_message>
Completar revisión solicitada por el tutor
</commit_message>
<xml_diff>
--- a/Guia_01_Flujo_y_funcionamiento.docx
+++ b/Guia_01_Flujo_y_funcionamiento.docx
@@ -948,7 +948,7 @@
           <w:color w:val="1F2937"/>
           <w:sz w:val="22"/>
         </w:rPr>
-        <w:t>El parser usa email.parser.BytesParser con una política MIME estándar. Conserva todas las cabeceras repetidas, no solo la última, y serializa las cabeceras originales junto al cuerpo para que SPF, DKIM, DMARC, Received, Return-Path y Message-ID sean visibles a las reglas.</w:t>
+        <w:t>El parser usa email.parser.BytesParser con una política MIME estándar. Conserva todas las cabeceras repetidas, no solo la última, y serializa las cabeceras originales junto al cuerpo. SPF, DKIM y DMARC se interpretan únicamente desde Received-SPF, Authentication-Results, ARC-Authentication-Results y DKIM-Signature: el prototipo no consulta DNS, no recupera claves públicas y no realiza una validación criptográfica completa.</w:t>
       </w:r>
     </w:p>
     <w:p>
@@ -1596,22 +1596,7 @@
           <w:color w:val="1F2937"/>
           <w:sz w:val="22"/>
         </w:rPr>
-        <w:t>El análisis es apoyo a la decisión, no sustituto de una pasarela antispam ni garantía absoluta.</w:t>
-      </w:r>
-    </w:p>
-    <w:p>
-      <w:pPr>
-        <w:pStyle w:val="ListBullet"/>
-      </w:pPr>
-      <w:r>
-        <w:rPr>
-          <w:rFonts w:ascii="Calibri" w:hAnsi="Calibri"/>
-          <w:b w:val="0"/>
-          <w:i w:val="0"/>
-          <w:color w:val="1F2937"/>
-          <w:sz w:val="22"/>
-        </w:rPr>
-        <w:t>El MLP necesita datos representativos y evaluación separada; una accuracy de entrenamiento no demuestra generalización. La evidencia funcional suma 87 pruebas Python y 2 recorridos reales (web-backend y Gmail-HTTP-Telegram): verifican arquitectura y comportamiento, no eficacia estadística en producción.</w:t>
+        <w:t>El análisis apoya decisiones y las 87 pruebas más 2 recorridos validan el flujo, no la eficacia en producción; el MLP requiere datos representativos y evaluación separada.</w:t>
       </w:r>
     </w:p>
     <w:sectPr>

</xml_diff>

<commit_message>
Completar evaluacion reproducible y defensa
</commit_message>
<xml_diff>
--- a/Guia_01_Flujo_y_funcionamiento.docx
+++ b/Guia_01_Flujo_y_funcionamiento.docx
@@ -1546,7 +1546,7 @@
           <w:color w:val="1F2937"/>
           <w:sz w:val="22"/>
         </w:rPr>
-        <w:t>5. El modo combinado aplica la fusión calibrada 35/65 y el umbral 26; si una evidencia alcanza 70 no se diluye, y la explicación muestra qué señales activaron el riesgo.</w:t>
+        <w:t>5. El modo combinado aplica la fusión calibrada 45/55 y el umbral 21; si una evidencia alcanza 70 no se diluye, y la explicación muestra qué señales activaron el riesgo.</w:t>
       </w:r>
     </w:p>
     <w:p>
@@ -1596,7 +1596,7 @@
           <w:color w:val="1F2937"/>
           <w:sz w:val="22"/>
         </w:rPr>
-        <w:t>El análisis apoya decisiones y las 87 pruebas más 2 recorridos validan el flujo, no la eficacia en producción; el MLP requiere datos representativos y evaluación separada.</w:t>
+        <w:t>El análisis apoya decisiones y las 89 pruebas más 2 recorridos validan el flujo, no la eficacia en producción; el MLP requiere datos representativos y evaluación separada.</w:t>
       </w:r>
     </w:p>
     <w:sectPr>

</xml_diff>